<commit_message>
Update report with algorithm understanding steps and add figures
- Added struggle/learning moments to iterative development sections
- Added gap problem figure showing false dead signal during collection gaps
- Added ROC decay figure for multi-horizon prediction
- Shortened scraping iterations, expanded ML content
- Reordered iterations chronologically (pool before prediction)
- Cleaned up quotes, removed scenario/anchoring iteration
- 16 assessment figures added to repo

Co-Authored-By: Claude Opus 4.6 (1M context) <noreply@anthropic.com>
</commit_message>
<xml_diff>
--- a/Assessment_2_Final_v2.docx
+++ b/Assessment_2_Final_v2.docx
@@ -790,7 +790,7 @@
           <w:b w:val="0"/>
           <w:i w:val="0"/>
         </w:rPr>
-        <w:t>Iteration 6: Multi-horizon classifiers. Seventeen classifiers were built for prediction horizons from 1 hour to 7 days. ROC AUC decayed from 0.843 (1 hour) to approximately 0.57 (7 days). At 7 days, accuracy paradoxically rose to 85% while ROC dropped, because predicting "everything dies" achieves high accuracy but zero discriminative power. This demonstrated why ROC AUC is a more appropriate metric than accuracy for imbalanced classification.</w:t>
+        <w:t>Iteration 6: Multi-horizon classifiers and learning to evaluate models. Seventeen classifiers were built for prediction horizons from 1 hour to 7 days. ROC AUC decayed from 0.843 (1 hour) to approximately 0.57 (7 days). Understanding these results required learning what ROC AUC actually measures — I initially confused it with accuracy and had to work through the basics. But this learning process led to the project’s most important methodological insight: at 7 days, accuracy paradoxically rises to 85% while ROC drops to 0.57. Since 86% of posts are dead at 7 days, predicting “everything dies” achieves high accuracy but zero discriminative power. ROC AUC exposes this. I later applied this understanding to challenge the AI’s framing of emerging keyword detection, questioning whether the metric measured what we claimed it measured.</w:t>
       </w:r>
     </w:p>
     <w:p>
@@ -816,6 +816,9 @@
           <w:b w:val="0"/>
           <w:i w:val="0"/>
         </w:rPr>
+        <w:t>Post-level prediction worked well at short horizons but degraded beyond 24 hours. The frustration was clear: I could predict individual post flow but not keywords or topics. I wanted to predict general flow — not individual posts but the overall story. I also wanted magnitude prediction: how much will it grow, not just whether it will grow. Testing Szabo-Huberman log-linear models for magnitude prediction failed (R²=0.22), confirming that classification (will it grow?) works but regression (by how much?) does not. The transition to topic-level prediction was my initiative, not suggested by the AI.</w:t>
+        <w:br/>
+        <w:br/>
         <w:t>Iteration 8: Co-occurrence pair detection. The transition from single keywords to two-word pairs was the most significant methodological improvement. Pairs such as "russian+tanker" and "birthright+citizenship" represent specific stories rather than generic vocabulary. Temporal validation (trained on days 1-8, tested on days 9-13) achieved 0.813 ROC AUC for detecting topics at 1-3 posts that would grow to 5 or more.</w:t>
       </w:r>
     </w:p>
@@ -2606,7 +2609,7 @@
           <w:b w:val="0"/>
           <w:i w:val="0"/>
         </w:rPr>
-        <w:t>Default model assumptions. Both Codex and Claude Code defaulted to Random Forest for every classification task without suggesting simpler alternatives. Testing revealed that Logistic Regression outperforms Random Forest on the core emergence detection task, indicating the signal is linear. This was not discovered until the developer explicitly requested model comparison.</w:t>
+        <w:t>Default model assumptions. I noticed that both Codex and Claude Code used Random Forest for every single task: “wait so we using random forest everywhere?” This prompted the five-classifier comparison, which revealed Logistic Regression outperforms Random Forest on the core emergence detection task (0.860 vs 0.829 ROC AUC), indicating the signal is linear. This was not discovered until I explicitly requested comparison.</w:t>
       </w:r>
     </w:p>
     <w:p>
@@ -2615,7 +2618,7 @@
           <w:b w:val="0"/>
           <w:i w:val="0"/>
         </w:rPr>
-        <w:t>Redundant feature suggestions. Claude Code recommended using post-level activity state labels (surging, alive, cooling, dying, dead) as features for topic-level prediction. These labels are discretised velocity values and showed no separation between growing and non-growing topics (alive ratio: 0.9x). The developer identified this as redundant information.</w:t>
+        <w:t>Redundant feature suggestions. Claude Code recommended using post-level activity state labels (surging, alive, cooling, dying, dead) as features for topic prediction. I rejected this: “alive/surging state labels don’t help they never should have i don’t know why claud suggested using them.” These labels are discretised velocity values — using both velocity AND states is redundant. At topic level, the raw signals (velocity, comments, upvotes) matter, not the discretised buckets.</w:t>
       </w:r>
     </w:p>
     <w:p>
@@ -2624,7 +2627,7 @@
           <w:b w:val="0"/>
           <w:i w:val="0"/>
         </w:rPr>
-        <w:t>Premature ceiling claims. AI tools declared performance ceilings multiple times during development. The developer pushed past each one, subsequently discovering the topic lifecycle pipeline, subreddit spread prediction, death definition analysis, and the ongoing-vs-one-shot classification, each of which produced strong results.</w:t>
+        <w:t>Premature ceiling claims. AI declared performance ceilings multiple times during development. Each time, I pushed past: discovering the topic lifecycle pipeline, co-occurrence pair detection, subreddit spread prediction, ongoing-vs-one-shot classification, and the post-topic bridge via first-post comment count. The shift from post-level to topic-level prediction itself was my initiative — the AI had not suggested this direction.</w:t>
       </w:r>
     </w:p>
     <w:p>
@@ -2633,7 +2636,7 @@
           <w:b w:val="0"/>
           <w:i w:val="0"/>
         </w:rPr>
-        <w:t>Hyperparameter negligence. Default or near-default parameters were used throughout until the developer requested tuning. Decision Tree performance improved by +0.265 ROC AUC and Gradient Boosting by +0.122 simply by adjusting tree depth and learning rate.</w:t>
+        <w:t>Hyperparameter negligence. Default or near-default parameters were used throughout until I requested tuning. Decision Tree improved by +0.265 ROC AUC and Gradient Boosting by +0.122 simply by adjusting tree depth and learning rate — basic tuning the AI should have suggested from the start.</w:t>
       </w:r>
     </w:p>
     <w:p>

</xml_diff>